<commit_message>
New file to repo
</commit_message>
<xml_diff>
--- a/AnsibleNotes.docx
+++ b/AnsibleNotes.docx
@@ -522,6 +522,13 @@
         </w:rPr>
         <w:lastRenderedPageBreak/>
         <w:t>2. YAML Basics (Ansible uses YAML everywhere)</w:t>
+      </w:r>
+      <w:r>
+        <w:rPr>
+          <w:b/>
+          <w:bCs/>
+        </w:rPr>
+        <w:t>.</w:t>
       </w:r>
     </w:p>
     <w:p>
@@ -8029,7 +8036,7 @@
     <w:p>
       <w:r>
         <w:pict w14:anchorId="50F2C15D">
-          <v:rect id="_x0000_i1174" style="width:0;height:1.5pt" o:hralign="center" o:hrstd="t" o:hr="t" fillcolor="#a0a0a0" stroked="f"/>
+          <v:rect id="_x0000_i1025" style="width:0;height:1.5pt" o:hralign="center" o:hrstd="t" o:hr="t" fillcolor="#a0a0a0" stroked="f"/>
         </w:pict>
       </w:r>
     </w:p>
@@ -8151,7 +8158,7 @@
     <w:p>
       <w:r>
         <w:pict w14:anchorId="0BF0E7C0">
-          <v:rect id="_x0000_i1175" style="width:0;height:1.5pt" o:hralign="center" o:hrstd="t" o:hr="t" fillcolor="#a0a0a0" stroked="f"/>
+          <v:rect id="_x0000_i1026" style="width:0;height:1.5pt" o:hralign="center" o:hrstd="t" o:hr="t" fillcolor="#a0a0a0" stroked="f"/>
         </w:pict>
       </w:r>
     </w:p>
@@ -8505,7 +8512,7 @@
     <w:p>
       <w:r>
         <w:pict w14:anchorId="33F777DC">
-          <v:rect id="_x0000_i1176" style="width:0;height:1.5pt" o:hralign="center" o:hrstd="t" o:hr="t" fillcolor="#a0a0a0" stroked="f"/>
+          <v:rect id="_x0000_i1027" style="width:0;height:1.5pt" o:hralign="center" o:hrstd="t" o:hr="t" fillcolor="#a0a0a0" stroked="f"/>
         </w:pict>
       </w:r>
     </w:p>
@@ -17030,6 +17037,7 @@
   <w:style w:type="character" w:default="1" w:styleId="DefaultParagraphFont">
     <w:name w:val="Default Paragraph Font"/>
     <w:uiPriority w:val="1"/>
+    <w:semiHidden/>
     <w:unhideWhenUsed/>
   </w:style>
   <w:style w:type="table" w:default="1" w:styleId="TableNormal">

</xml_diff>